<commit_message>
docs: present project as smart parking system
</commit_message>
<xml_diff>
--- a/doc/product_mgt/园区停车场系统设计v2-20260212.docx
+++ b/doc/product_mgt/园区停车场系统设计v2-20260212.docx
@@ -13,7 +13,7 @@
           <w:b/>
           <w:sz w:val="52"/>
         </w:rPr>
-        <w:t>AI智能停车场管理系统 - 功能需求设计文档</w:t>
+        <w:t>智能停车管理系统 - 早期功能需求设计文档</w:t>
       </w:r>
     </w:p>
     <w:p>
@@ -53,7 +53,7 @@
           <w:b/>
           <w:sz w:val="22"/>
         </w:rPr>
-        <w:t>AI 智能停车场管理系统</w:t>
+        <w:t>智能停车管理系统</w:t>
       </w:r>
       <w:r>
         <w:rPr>
@@ -61,6 +61,18 @@
           <w:sz w:val="22"/>
         </w:rPr>
         <w:t>的标准化需求设计文档，面向 AI 编码开发使用，对原始需求进行结构化、规范化、可落地化梳理，明确系统功能、业务规则、技术特性与交互逻辑，确保开发实现精准匹配业务目标。</w:t>
+      </w:r>
+    </w:p>
+    <w:p>
+      <w:pPr/>
+      <w:r>
+        <w:rPr>
+          <w:b/>
+        </w:rPr>
+        <w:t>历史版本说明：</w:t>
+      </w:r>
+      <w:r>
+        <w:t>本文件是 2026 年 2 月的早期需求与设计记录。文中“AI 模型”“AI 预测”和“最优调度”等属于当时的产品设想，不代表当前公开代码已经实现或验证。当前 v7 公开版采用可解释的规则式调度与确定性历史基线，功能边界以根目录 README.md 和 EVIDENCE_AND_LIMITATIONS.md 为准。</w:t>
       </w:r>
     </w:p>
     <w:p>

</xml_diff>

<commit_message>
docs: neutralize AI coding language
</commit_message>
<xml_diff>
--- a/doc/product_mgt/园区停车场系统设计v2-20260212.docx
+++ b/doc/product_mgt/园区停车场系统设计v2-20260212.docx
@@ -60,7 +60,7 @@
           <w:rFonts w:ascii="Arial" w:hAnsi="Arial" w:eastAsia="等线" w:cs="Arial"/>
           <w:sz w:val="22"/>
         </w:rPr>
-        <w:t>的标准化需求设计文档，面向 AI 编码开发使用，对原始需求进行结构化、规范化、可落地化梳理，明确系统功能、业务规则、技术特性与交互逻辑，确保开发实现精准匹配业务目标。</w:t>
+        <w:t>的标准化需求设计文档，用于指导系统设计、代码实现、测试与验收，对原始需求进行结构化、规范化、可落地化梳理，明确系统功能、业务规则、技术特性与交互逻辑，确保开发实现精准匹配业务目标。</w:t>
       </w:r>
     </w:p>
     <w:p>
@@ -1520,7 +1520,7 @@
           <w:b/>
           <w:sz w:val="32"/>
         </w:rPr>
-        <w:t>三、系统通用技术要求（AI 编码适配）</w:t>
+        <w:t>三、系统通用开发要求</w:t>
       </w:r>
       <w:bookmarkEnd w:id="23"/>
     </w:p>
@@ -1678,7 +1678,7 @@
           <w:b/>
           <w:sz w:val="32"/>
         </w:rPr>
-        <w:t>四、需求结构化对照表（AI 编码直接参考）</w:t>
+        <w:t>四、需求结构化对照表（开发实现参考）</w:t>
       </w:r>
       <w:bookmarkEnd w:id="24"/>
     </w:p>
@@ -2325,7 +2325,7 @@
           <w:rFonts w:ascii="Arial" w:hAnsi="Arial" w:eastAsia="等线" w:cs="Arial"/>
           <w:sz w:val="22"/>
         </w:rPr>
-        <w:t>，剔除模糊描述，明确功能规则、逻辑和交互，完全适配 AI 编码；</w:t>
+        <w:t>，剔除模糊描述，明确功能规则、逻辑和交互，便于开发实现与测试验收；</w:t>
       </w:r>
     </w:p>
     <w:p>

</xml_diff>